<commit_message>
commit final de juan, subido pdf y correcciones finales
</commit_message>
<xml_diff>
--- a/TP2/Programacion_UBA_TP2.docx
+++ b/TP2/Programacion_UBA_TP2.docx
@@ -135,8 +135,9 @@
           <w:sz w:val="28"/>
           <w:szCs w:val="28"/>
         </w:rPr>
-        <w:t xml:space="preserve">Trabajo Práctico N° </w:t>
-      </w:r>
+        <w:t xml:space="preserve">Trabajo Práctico </w:t>
+      </w:r>
+      <w:proofErr w:type="spellStart"/>
       <w:r>
         <w:rPr>
           <w:rFonts w:ascii="Century Schoolbook" w:eastAsia="Century Schoolbook" w:hAnsi="Century Schoolbook" w:cs="Century Schoolbook"/>
@@ -145,12 +146,10 @@
           <w:sz w:val="28"/>
           <w:szCs w:val="28"/>
         </w:rPr>
-        <w:t>2</w:t>
-      </w:r>
-    </w:p>
-    <w:p>
-      <w:pPr>
-        <w:jc w:val="center"/>
+        <w:t>N°</w:t>
+      </w:r>
+      <w:proofErr w:type="spellEnd"/>
+      <w:r>
         <w:rPr>
           <w:rFonts w:ascii="Century Schoolbook" w:eastAsia="Century Schoolbook" w:hAnsi="Century Schoolbook" w:cs="Century Schoolbook"/>
           <w:b/>
@@ -158,11 +157,9 @@
           <w:sz w:val="28"/>
           <w:szCs w:val="28"/>
         </w:rPr>
-      </w:pPr>
-    </w:p>
-    <w:p>
-      <w:pPr>
-        <w:jc w:val="center"/>
+        <w:t xml:space="preserve"> </w:t>
+      </w:r>
+      <w:r>
         <w:rPr>
           <w:rFonts w:ascii="Century Schoolbook" w:eastAsia="Century Schoolbook" w:hAnsi="Century Schoolbook" w:cs="Century Schoolbook"/>
           <w:b/>
@@ -170,8 +167,12 @@
           <w:sz w:val="28"/>
           <w:szCs w:val="28"/>
         </w:rPr>
-      </w:pPr>
-      <w:r>
+        <w:t>2</w:t>
+      </w:r>
+    </w:p>
+    <w:p>
+      <w:pPr>
+        <w:jc w:val="center"/>
         <w:rPr>
           <w:rFonts w:ascii="Century Schoolbook" w:eastAsia="Century Schoolbook" w:hAnsi="Century Schoolbook" w:cs="Century Schoolbook"/>
           <w:b/>
@@ -179,7 +180,50 @@
           <w:sz w:val="28"/>
           <w:szCs w:val="28"/>
         </w:rPr>
-        <w:t>Histogramas, Kernels &amp; Métodos No Supervisados usando la EPH</w:t>
+      </w:pPr>
+    </w:p>
+    <w:p>
+      <w:pPr>
+        <w:jc w:val="center"/>
+        <w:rPr>
+          <w:rFonts w:ascii="Century Schoolbook" w:eastAsia="Century Schoolbook" w:hAnsi="Century Schoolbook" w:cs="Century Schoolbook"/>
+          <w:b/>
+          <w:smallCaps/>
+          <w:sz w:val="28"/>
+          <w:szCs w:val="28"/>
+        </w:rPr>
+      </w:pPr>
+      <w:r>
+        <w:rPr>
+          <w:rFonts w:ascii="Century Schoolbook" w:eastAsia="Century Schoolbook" w:hAnsi="Century Schoolbook" w:cs="Century Schoolbook"/>
+          <w:b/>
+          <w:smallCaps/>
+          <w:sz w:val="28"/>
+          <w:szCs w:val="28"/>
+        </w:rPr>
+        <w:t xml:space="preserve">Histogramas, </w:t>
+      </w:r>
+      <w:proofErr w:type="spellStart"/>
+      <w:r>
+        <w:rPr>
+          <w:rFonts w:ascii="Century Schoolbook" w:eastAsia="Century Schoolbook" w:hAnsi="Century Schoolbook" w:cs="Century Schoolbook"/>
+          <w:b/>
+          <w:smallCaps/>
+          <w:sz w:val="28"/>
+          <w:szCs w:val="28"/>
+        </w:rPr>
+        <w:t>Kernels</w:t>
+      </w:r>
+      <w:proofErr w:type="spellEnd"/>
+      <w:r>
+        <w:rPr>
+          <w:rFonts w:ascii="Century Schoolbook" w:eastAsia="Century Schoolbook" w:hAnsi="Century Schoolbook" w:cs="Century Schoolbook"/>
+          <w:b/>
+          <w:smallCaps/>
+          <w:sz w:val="28"/>
+          <w:szCs w:val="28"/>
+        </w:rPr>
+        <w:t xml:space="preserve"> &amp; Métodos No Supervisados usando la EPH</w:t>
       </w:r>
     </w:p>
     <w:p>
@@ -282,7 +326,23 @@
           <w:rFonts w:ascii="Century Schoolbook" w:eastAsia="Century Schoolbook" w:hAnsi="Century Schoolbook" w:cs="Century Schoolbook"/>
           <w:color w:val="000000"/>
         </w:rPr>
-        <w:t xml:space="preserve"> hs.</w:t>
+        <w:t xml:space="preserve"> </w:t>
+      </w:r>
+      <w:proofErr w:type="spellStart"/>
+      <w:r>
+        <w:rPr>
+          <w:rFonts w:ascii="Century Schoolbook" w:eastAsia="Century Schoolbook" w:hAnsi="Century Schoolbook" w:cs="Century Schoolbook"/>
+          <w:color w:val="000000"/>
+        </w:rPr>
+        <w:t>hs</w:t>
+      </w:r>
+      <w:proofErr w:type="spellEnd"/>
+      <w:r>
+        <w:rPr>
+          <w:rFonts w:ascii="Century Schoolbook" w:eastAsia="Century Schoolbook" w:hAnsi="Century Schoolbook" w:cs="Century Schoolbook"/>
+          <w:color w:val="000000"/>
+        </w:rPr>
+        <w:t>.</w:t>
       </w:r>
     </w:p>
     <w:p>
@@ -323,7 +383,35 @@
         <w:rPr>
           <w:rFonts w:ascii="Century Schoolbook" w:eastAsia="Century Schoolbook" w:hAnsi="Century Schoolbook" w:cs="Century Schoolbook"/>
         </w:rPr>
-        <w:t>familiarización con la base de datos de la Encuesta Permanente de Hogares. Hacer una ejercitación de Histogramas &amp; Kernels y los métodos no supervisados vistos en clase (PCA &amp; Cluster).</w:t>
+        <w:t xml:space="preserve">familiarización con la base de datos de la Encuesta Permanente de Hogares. Hacer una ejercitación de Histogramas &amp; </w:t>
+      </w:r>
+      <w:proofErr w:type="spellStart"/>
+      <w:r>
+        <w:rPr>
+          <w:rFonts w:ascii="Century Schoolbook" w:eastAsia="Century Schoolbook" w:hAnsi="Century Schoolbook" w:cs="Century Schoolbook"/>
+        </w:rPr>
+        <w:t>Kernels</w:t>
+      </w:r>
+      <w:proofErr w:type="spellEnd"/>
+      <w:r>
+        <w:rPr>
+          <w:rFonts w:ascii="Century Schoolbook" w:eastAsia="Century Schoolbook" w:hAnsi="Century Schoolbook" w:cs="Century Schoolbook"/>
+        </w:rPr>
+        <w:t xml:space="preserve"> y los métodos no supervisados vistos en clase (PCA &amp; </w:t>
+      </w:r>
+      <w:proofErr w:type="spellStart"/>
+      <w:r>
+        <w:rPr>
+          <w:rFonts w:ascii="Century Schoolbook" w:eastAsia="Century Schoolbook" w:hAnsi="Century Schoolbook" w:cs="Century Schoolbook"/>
+        </w:rPr>
+        <w:t>Cluster</w:t>
+      </w:r>
+      <w:proofErr w:type="spellEnd"/>
+      <w:r>
+        <w:rPr>
+          <w:rFonts w:ascii="Century Schoolbook" w:eastAsia="Century Schoolbook" w:hAnsi="Century Schoolbook" w:cs="Century Schoolbook"/>
+        </w:rPr>
+        <w:t>).</w:t>
       </w:r>
     </w:p>
     <w:p>
@@ -354,11 +442,19 @@
           <w:rFonts w:ascii="Century Schoolbook" w:eastAsia="Century Schoolbook" w:hAnsi="Century Schoolbook" w:cs="Century Schoolbook"/>
         </w:rPr>
       </w:pPr>
-      <w:r>
-        <w:rPr>
-          <w:rFonts w:ascii="Century Schoolbook" w:eastAsia="Century Schoolbook" w:hAnsi="Century Schoolbook" w:cs="Century Schoolbook"/>
-        </w:rPr>
-        <w:t>Asegurense de haber creado una carpeta llamada TP</w:t>
+      <w:proofErr w:type="spellStart"/>
+      <w:r>
+        <w:rPr>
+          <w:rFonts w:ascii="Century Schoolbook" w:eastAsia="Century Schoolbook" w:hAnsi="Century Schoolbook" w:cs="Century Schoolbook"/>
+        </w:rPr>
+        <w:t>Asegurense</w:t>
+      </w:r>
+      <w:proofErr w:type="spellEnd"/>
+      <w:r>
+        <w:rPr>
+          <w:rFonts w:ascii="Century Schoolbook" w:eastAsia="Century Schoolbook" w:hAnsi="Century Schoolbook" w:cs="Century Schoolbook"/>
+        </w:rPr>
+        <w:t xml:space="preserve"> de haber creado una carpeta llamada TP</w:t>
       </w:r>
       <w:r>
         <w:rPr>
@@ -552,7 +648,35 @@
         <w:rPr>
           <w:rFonts w:ascii="Century Schoolbook" w:eastAsia="Century Schoolbook" w:hAnsi="Century Schoolbook" w:cs="Century Schoolbook"/>
         </w:rPr>
-        <w:t>Al finalizar el trabajo práctico deben hacer un último commit en su repositorio de GitHub llamado “Entrega final del tp”.</w:t>
+        <w:t xml:space="preserve">Al finalizar el trabajo práctico deben hacer un último </w:t>
+      </w:r>
+      <w:proofErr w:type="spellStart"/>
+      <w:r>
+        <w:rPr>
+          <w:rFonts w:ascii="Century Schoolbook" w:eastAsia="Century Schoolbook" w:hAnsi="Century Schoolbook" w:cs="Century Schoolbook"/>
+        </w:rPr>
+        <w:t>commit</w:t>
+      </w:r>
+      <w:proofErr w:type="spellEnd"/>
+      <w:r>
+        <w:rPr>
+          <w:rFonts w:ascii="Century Schoolbook" w:eastAsia="Century Schoolbook" w:hAnsi="Century Schoolbook" w:cs="Century Schoolbook"/>
+        </w:rPr>
+        <w:t xml:space="preserve"> en su repositorio de GitHub llamado “Entrega final del </w:t>
+      </w:r>
+      <w:proofErr w:type="spellStart"/>
+      <w:r>
+        <w:rPr>
+          <w:rFonts w:ascii="Century Schoolbook" w:eastAsia="Century Schoolbook" w:hAnsi="Century Schoolbook" w:cs="Century Schoolbook"/>
+        </w:rPr>
+        <w:t>tp</w:t>
+      </w:r>
+      <w:proofErr w:type="spellEnd"/>
+      <w:r>
+        <w:rPr>
+          <w:rFonts w:ascii="Century Schoolbook" w:eastAsia="Century Schoolbook" w:hAnsi="Century Schoolbook" w:cs="Century Schoolbook"/>
+        </w:rPr>
+        <w:t>”.</w:t>
       </w:r>
     </w:p>
     <w:p>
@@ -570,7 +694,21 @@
         <w:rPr>
           <w:rFonts w:ascii="Century Schoolbook" w:eastAsia="Century Schoolbook" w:hAnsi="Century Schoolbook" w:cs="Century Schoolbook"/>
         </w:rPr>
-        <w:t>El Jupyter Notebook y el correspondiente al TP</w:t>
+        <w:t xml:space="preserve">El </w:t>
+      </w:r>
+      <w:proofErr w:type="spellStart"/>
+      <w:r>
+        <w:rPr>
+          <w:rFonts w:ascii="Century Schoolbook" w:eastAsia="Century Schoolbook" w:hAnsi="Century Schoolbook" w:cs="Century Schoolbook"/>
+        </w:rPr>
+        <w:t>Jupyter</w:t>
+      </w:r>
+      <w:proofErr w:type="spellEnd"/>
+      <w:r>
+        <w:rPr>
+          <w:rFonts w:ascii="Century Schoolbook" w:eastAsia="Century Schoolbook" w:hAnsi="Century Schoolbook" w:cs="Century Schoolbook"/>
+        </w:rPr>
+        <w:t xml:space="preserve"> Notebook y el correspondiente al TP</w:t>
       </w:r>
       <w:r>
         <w:rPr>
@@ -636,7 +774,21 @@
         <w:rPr>
           <w:rFonts w:ascii="Century Schoolbook" w:eastAsia="Century Schoolbook" w:hAnsi="Century Schoolbook" w:cs="Century Schoolbook"/>
         </w:rPr>
-        <w:t>el pdf en la sección de “</w:t>
+        <w:t xml:space="preserve">el </w:t>
+      </w:r>
+      <w:proofErr w:type="spellStart"/>
+      <w:r>
+        <w:rPr>
+          <w:rFonts w:ascii="Century Schoolbook" w:eastAsia="Century Schoolbook" w:hAnsi="Century Schoolbook" w:cs="Century Schoolbook"/>
+        </w:rPr>
+        <w:t>pdf</w:t>
+      </w:r>
+      <w:proofErr w:type="spellEnd"/>
+      <w:r>
+        <w:rPr>
+          <w:rFonts w:ascii="Century Schoolbook" w:eastAsia="Century Schoolbook" w:hAnsi="Century Schoolbook" w:cs="Century Schoolbook"/>
+        </w:rPr>
+        <w:t xml:space="preserve"> en la sección de “</w:t>
       </w:r>
       <w:hyperlink r:id="rId8" w:history="1">
         <w:r>
@@ -669,6 +821,7 @@
         </w:rPr>
         <w:t xml:space="preserve"> hasta no haber terminado y estar seguros de que han hecho el </w:t>
       </w:r>
+      <w:proofErr w:type="spellStart"/>
       <w:r>
         <w:rPr>
           <w:rFonts w:ascii="Century Schoolbook" w:eastAsia="Century Schoolbook" w:hAnsi="Century Schoolbook" w:cs="Century Schoolbook"/>
@@ -676,12 +829,14 @@
         </w:rPr>
         <w:t>commit</w:t>
       </w:r>
+      <w:proofErr w:type="spellEnd"/>
       <w:r>
         <w:rPr>
           <w:rFonts w:ascii="Century Schoolbook" w:eastAsia="Century Schoolbook" w:hAnsi="Century Schoolbook" w:cs="Century Schoolbook"/>
         </w:rPr>
         <w:t xml:space="preserve"> y </w:t>
       </w:r>
+      <w:proofErr w:type="spellStart"/>
       <w:r>
         <w:rPr>
           <w:rFonts w:ascii="Century Schoolbook" w:eastAsia="Century Schoolbook" w:hAnsi="Century Schoolbook" w:cs="Century Schoolbook"/>
@@ -689,6 +844,7 @@
         </w:rPr>
         <w:t>push</w:t>
       </w:r>
+      <w:proofErr w:type="spellEnd"/>
       <w:r>
         <w:rPr>
           <w:rFonts w:ascii="Century Schoolbook" w:eastAsia="Century Schoolbook" w:hAnsi="Century Schoolbook" w:cs="Century Schoolbook"/>
@@ -713,6 +869,7 @@
         </w:rPr>
         <w:t xml:space="preserve">No hagan nuevos </w:t>
       </w:r>
+      <w:proofErr w:type="spellStart"/>
       <w:r>
         <w:rPr>
           <w:rFonts w:ascii="Century Schoolbook" w:eastAsia="Century Schoolbook" w:hAnsi="Century Schoolbook" w:cs="Century Schoolbook"/>
@@ -720,6 +877,7 @@
         </w:rPr>
         <w:t>push</w:t>
       </w:r>
+      <w:proofErr w:type="spellEnd"/>
       <w:r>
         <w:rPr>
           <w:rFonts w:ascii="Century Schoolbook" w:eastAsia="Century Schoolbook" w:hAnsi="Century Schoolbook" w:cs="Century Schoolbook"/>
@@ -750,7 +908,21 @@
         <w:rPr>
           <w:rFonts w:ascii="Century Schoolbook" w:eastAsia="Century Schoolbook" w:hAnsi="Century Schoolbook" w:cs="Century Schoolbook"/>
         </w:rPr>
-        <w:t>en en la sección de “</w:t>
+        <w:t xml:space="preserve">en </w:t>
+      </w:r>
+      <w:proofErr w:type="spellStart"/>
+      <w:r>
+        <w:rPr>
+          <w:rFonts w:ascii="Century Schoolbook" w:eastAsia="Century Schoolbook" w:hAnsi="Century Schoolbook" w:cs="Century Schoolbook"/>
+        </w:rPr>
+        <w:t>en</w:t>
+      </w:r>
+      <w:proofErr w:type="spellEnd"/>
+      <w:r>
+        <w:rPr>
+          <w:rFonts w:ascii="Century Schoolbook" w:eastAsia="Century Schoolbook" w:hAnsi="Century Schoolbook" w:cs="Century Schoolbook"/>
+        </w:rPr>
+        <w:t xml:space="preserve"> la sección de “</w:t>
       </w:r>
       <w:hyperlink r:id="rId9" w:history="1">
         <w:r>
@@ -828,7 +1000,21 @@
         <w:rPr>
           <w:rFonts w:ascii="Century Schoolbook" w:eastAsia="Century Schoolbook" w:hAnsi="Century Schoolbook" w:cs="Century Schoolbook"/>
         </w:rPr>
-        <w:t xml:space="preserve">Además, deben adjuntar en el documento del informe el link del repositorio público del Github donde tienen los códigos que utilizaron para resolver el trabajo práctico. </w:t>
+        <w:t xml:space="preserve">Además, deben adjuntar en el documento del informe el link del repositorio público del </w:t>
+      </w:r>
+      <w:proofErr w:type="spellStart"/>
+      <w:r>
+        <w:rPr>
+          <w:rFonts w:ascii="Century Schoolbook" w:eastAsia="Century Schoolbook" w:hAnsi="Century Schoolbook" w:cs="Century Schoolbook"/>
+        </w:rPr>
+        <w:t>Github</w:t>
+      </w:r>
+      <w:proofErr w:type="spellEnd"/>
+      <w:r>
+        <w:rPr>
+          <w:rFonts w:ascii="Century Schoolbook" w:eastAsia="Century Schoolbook" w:hAnsi="Century Schoolbook" w:cs="Century Schoolbook"/>
+        </w:rPr>
+        <w:t xml:space="preserve"> donde tienen los códigos que utilizaron para resolver el trabajo práctico. </w:t>
       </w:r>
     </w:p>
     <w:p>
@@ -940,7 +1126,27 @@
           <w:szCs w:val="32"/>
         </w:rPr>
         <w:lastRenderedPageBreak/>
-        <w:t>Parte I: Creación de variables, histogramas, kernels y resumen de la base de datos final</w:t>
+        <w:t xml:space="preserve">Parte I: Creación de variables, histogramas, </w:t>
+      </w:r>
+      <w:proofErr w:type="spellStart"/>
+      <w:r>
+        <w:rPr>
+          <w:rFonts w:ascii="Century Schoolbook" w:eastAsia="Century Schoolbook" w:hAnsi="Century Schoolbook" w:cs="Century Schoolbook"/>
+          <w:color w:val="002060"/>
+          <w:sz w:val="32"/>
+          <w:szCs w:val="32"/>
+        </w:rPr>
+        <w:t>kernels</w:t>
+      </w:r>
+      <w:proofErr w:type="spellEnd"/>
+      <w:r>
+        <w:rPr>
+          <w:rFonts w:ascii="Century Schoolbook" w:eastAsia="Century Schoolbook" w:hAnsi="Century Schoolbook" w:cs="Century Schoolbook"/>
+          <w:color w:val="002060"/>
+          <w:sz w:val="32"/>
+          <w:szCs w:val="32"/>
+        </w:rPr>
+        <w:t xml:space="preserve"> y resumen de la base de datos final</w:t>
       </w:r>
     </w:p>
     <w:p>
@@ -966,12 +1172,21 @@
         </w:rPr>
         <w:t xml:space="preserve">La idea de esta primera parte es que </w:t>
       </w:r>
-      <w:r>
-        <w:rPr>
-          <w:rFonts w:ascii="Century Schoolbook" w:eastAsia="Century Schoolbook" w:hAnsi="Century Schoolbook" w:cs="Century Schoolbook"/>
-          <w:color w:val="000000"/>
-        </w:rPr>
-        <w:t>continuen con</w:t>
+      <w:proofErr w:type="spellStart"/>
+      <w:r>
+        <w:rPr>
+          <w:rFonts w:ascii="Century Schoolbook" w:eastAsia="Century Schoolbook" w:hAnsi="Century Schoolbook" w:cs="Century Schoolbook"/>
+          <w:color w:val="000000"/>
+        </w:rPr>
+        <w:t>continuen</w:t>
+      </w:r>
+      <w:proofErr w:type="spellEnd"/>
+      <w:r>
+        <w:rPr>
+          <w:rFonts w:ascii="Century Schoolbook" w:eastAsia="Century Schoolbook" w:hAnsi="Century Schoolbook" w:cs="Century Schoolbook"/>
+          <w:color w:val="000000"/>
+        </w:rPr>
+        <w:t xml:space="preserve"> con</w:t>
       </w:r>
       <w:r>
         <w:rPr>
@@ -1149,7 +1364,23 @@
           <w:rFonts w:ascii="Century Schoolbook" w:eastAsia="Century Schoolbook" w:hAnsi="Century Schoolbook" w:cs="Century Schoolbook"/>
           <w:color w:val="000000"/>
         </w:rPr>
-        <w:t xml:space="preserve"> (edad al cuadrado). Presente un histograma de la variable edad en un panel A, y a la par una distribución de kernels para los </w:t>
+        <w:t xml:space="preserve"> (edad al cuadrado). Presente un histograma de la variable edad en un panel A, y a la par una distribución de </w:t>
+      </w:r>
+      <w:proofErr w:type="spellStart"/>
+      <w:r>
+        <w:rPr>
+          <w:rFonts w:ascii="Century Schoolbook" w:eastAsia="Century Schoolbook" w:hAnsi="Century Schoolbook" w:cs="Century Schoolbook"/>
+          <w:color w:val="000000"/>
+        </w:rPr>
+        <w:t>kernels</w:t>
+      </w:r>
+      <w:proofErr w:type="spellEnd"/>
+      <w:r>
+        <w:rPr>
+          <w:rFonts w:ascii="Century Schoolbook" w:eastAsia="Century Schoolbook" w:hAnsi="Century Schoolbook" w:cs="Century Schoolbook"/>
+          <w:color w:val="000000"/>
+        </w:rPr>
+        <w:t xml:space="preserve"> para los </w:t>
       </w:r>
       <w:r>
         <w:rPr>
@@ -1188,7 +1419,23 @@
           <w:rFonts w:ascii="Century Schoolbook" w:eastAsia="Century Schoolbook" w:hAnsi="Century Schoolbook" w:cs="Century Schoolbook"/>
           <w:color w:val="000000"/>
         </w:rPr>
-        <w:t xml:space="preserve"> de kernel en este segundo panel). Comente brevemente la distribución de edades en estos dos </w:t>
+        <w:t xml:space="preserve"> de </w:t>
+      </w:r>
+      <w:proofErr w:type="spellStart"/>
+      <w:r>
+        <w:rPr>
+          <w:rFonts w:ascii="Century Schoolbook" w:eastAsia="Century Schoolbook" w:hAnsi="Century Schoolbook" w:cs="Century Schoolbook"/>
+          <w:color w:val="000000"/>
+        </w:rPr>
+        <w:t>kernel</w:t>
+      </w:r>
+      <w:proofErr w:type="spellEnd"/>
+      <w:r>
+        <w:rPr>
+          <w:rFonts w:ascii="Century Schoolbook" w:eastAsia="Century Schoolbook" w:hAnsi="Century Schoolbook" w:cs="Century Schoolbook"/>
+          <w:color w:val="000000"/>
+        </w:rPr>
+        <w:t xml:space="preserve"> en este segundo panel). Comente brevemente la distribución de edades en estos dos </w:t>
       </w:r>
       <w:r>
         <w:rPr>
@@ -1231,6 +1478,7 @@
         </w:rPr>
         <w:t xml:space="preserve">Cree la variable </w:t>
       </w:r>
+      <w:proofErr w:type="spellStart"/>
       <w:r>
         <w:rPr>
           <w:rFonts w:ascii="Century Schoolbook" w:eastAsia="Century Schoolbook" w:hAnsi="Century Schoolbook" w:cs="Century Schoolbook"/>
@@ -1239,6 +1487,7 @@
         </w:rPr>
         <w:t>educ</w:t>
       </w:r>
+      <w:proofErr w:type="spellEnd"/>
       <w:r>
         <w:rPr>
           <w:rFonts w:ascii="Century Schoolbook" w:eastAsia="Century Schoolbook" w:hAnsi="Century Schoolbook" w:cs="Century Schoolbook"/>
@@ -1259,20 +1508,46 @@
         </w:rPr>
         <w:t xml:space="preserve"> año que aprobó (CH14) fue “sexto”, entonces puede asumir que tiene  </w:t>
       </w:r>
+      <w:proofErr w:type="spellStart"/>
       <w:r>
         <w:rPr>
           <w:rFonts w:ascii="Century Schoolbook" w:eastAsia="Century Schoolbook" w:hAnsi="Century Schoolbook" w:cs="Century Schoolbook"/>
           <w:i/>
           <w:color w:val="000000"/>
         </w:rPr>
-        <w:t>educ=12</w:t>
-      </w:r>
-      <w:r>
-        <w:rPr>
-          <w:rFonts w:ascii="Century Schoolbook" w:eastAsia="Century Schoolbook" w:hAnsi="Century Schoolbook" w:cs="Century Schoolbook"/>
-          <w:color w:val="000000"/>
-        </w:rPr>
-        <w:t xml:space="preserve">, osea 12 años de educación formal. Presente una </w:t>
+        <w:t>educ</w:t>
+      </w:r>
+      <w:proofErr w:type="spellEnd"/>
+      <w:r>
+        <w:rPr>
+          <w:rFonts w:ascii="Century Schoolbook" w:eastAsia="Century Schoolbook" w:hAnsi="Century Schoolbook" w:cs="Century Schoolbook"/>
+          <w:i/>
+          <w:color w:val="000000"/>
+        </w:rPr>
+        <w:t>=12</w:t>
+      </w:r>
+      <w:r>
+        <w:rPr>
+          <w:rFonts w:ascii="Century Schoolbook" w:eastAsia="Century Schoolbook" w:hAnsi="Century Schoolbook" w:cs="Century Schoolbook"/>
+          <w:color w:val="000000"/>
+        </w:rPr>
+        <w:t xml:space="preserve">, </w:t>
+      </w:r>
+      <w:proofErr w:type="spellStart"/>
+      <w:r>
+        <w:rPr>
+          <w:rFonts w:ascii="Century Schoolbook" w:eastAsia="Century Schoolbook" w:hAnsi="Century Schoolbook" w:cs="Century Schoolbook"/>
+          <w:color w:val="000000"/>
+        </w:rPr>
+        <w:t>osea</w:t>
+      </w:r>
+      <w:proofErr w:type="spellEnd"/>
+      <w:r>
+        <w:rPr>
+          <w:rFonts w:ascii="Century Schoolbook" w:eastAsia="Century Schoolbook" w:hAnsi="Century Schoolbook" w:cs="Century Schoolbook"/>
+          <w:color w:val="000000"/>
+        </w:rPr>
+        <w:t xml:space="preserve"> 12 años de educación formal. Presente una </w:t>
       </w:r>
       <w:r>
         <w:rPr>
@@ -1285,7 +1560,39 @@
           <w:rFonts w:ascii="Century Schoolbook" w:eastAsia="Century Schoolbook" w:hAnsi="Century Schoolbook" w:cs="Century Schoolbook"/>
           <w:color w:val="000000"/>
         </w:rPr>
-        <w:t xml:space="preserve"> descriptiva (promedio, sd, min, p50, max) de dicha variable creada y comente</w:t>
+        <w:t xml:space="preserve"> descriptiva (promedio, </w:t>
+      </w:r>
+      <w:proofErr w:type="spellStart"/>
+      <w:r>
+        <w:rPr>
+          <w:rFonts w:ascii="Century Schoolbook" w:eastAsia="Century Schoolbook" w:hAnsi="Century Schoolbook" w:cs="Century Schoolbook"/>
+          <w:color w:val="000000"/>
+        </w:rPr>
+        <w:t>sd</w:t>
+      </w:r>
+      <w:proofErr w:type="spellEnd"/>
+      <w:r>
+        <w:rPr>
+          <w:rFonts w:ascii="Century Schoolbook" w:eastAsia="Century Schoolbook" w:hAnsi="Century Schoolbook" w:cs="Century Schoolbook"/>
+          <w:color w:val="000000"/>
+        </w:rPr>
+        <w:t xml:space="preserve">, min, p50, </w:t>
+      </w:r>
+      <w:proofErr w:type="spellStart"/>
+      <w:r>
+        <w:rPr>
+          <w:rFonts w:ascii="Century Schoolbook" w:eastAsia="Century Schoolbook" w:hAnsi="Century Schoolbook" w:cs="Century Schoolbook"/>
+          <w:color w:val="000000"/>
+        </w:rPr>
+        <w:t>max</w:t>
+      </w:r>
+      <w:proofErr w:type="spellEnd"/>
+      <w:r>
+        <w:rPr>
+          <w:rFonts w:ascii="Century Schoolbook" w:eastAsia="Century Schoolbook" w:hAnsi="Century Schoolbook" w:cs="Century Schoolbook"/>
+          <w:color w:val="000000"/>
+        </w:rPr>
+        <w:t>) de dicha variable creada y comente</w:t>
       </w:r>
     </w:p>
     <w:p>
@@ -1321,6 +1628,7 @@
         </w:rPr>
         <w:t xml:space="preserve"> la variable </w:t>
       </w:r>
+      <w:proofErr w:type="spellStart"/>
       <w:r>
         <w:rPr>
           <w:rFonts w:ascii="Century Schoolbook" w:eastAsia="Century Schoolbook" w:hAnsi="Century Schoolbook" w:cs="Century Schoolbook"/>
@@ -1328,6 +1636,7 @@
         </w:rPr>
         <w:t>ingreso_total_familiar</w:t>
       </w:r>
+      <w:proofErr w:type="spellEnd"/>
       <w:r>
         <w:rPr>
           <w:rFonts w:ascii="Century Schoolbook" w:eastAsia="Century Schoolbook" w:hAnsi="Century Schoolbook" w:cs="Century Schoolbook"/>
@@ -1439,6 +1748,7 @@
         </w:rPr>
         <w:t xml:space="preserve"> 1, presente en un panel A, un histograma de la variable </w:t>
       </w:r>
+      <w:proofErr w:type="spellStart"/>
       <w:r>
         <w:rPr>
           <w:rFonts w:ascii="Century Schoolbook" w:eastAsia="Century Schoolbook" w:hAnsi="Century Schoolbook" w:cs="Century Schoolbook"/>
@@ -1446,12 +1756,29 @@
         </w:rPr>
         <w:t>ingreso_total_familiar</w:t>
       </w:r>
-      <w:r>
-        <w:rPr>
-          <w:rFonts w:ascii="Century Schoolbook" w:eastAsia="Century Schoolbook" w:hAnsi="Century Schoolbook" w:cs="Century Schoolbook"/>
-          <w:color w:val="000000"/>
-        </w:rPr>
-        <w:t xml:space="preserve"> y las distribuciones de kernels para </w:t>
+      <w:proofErr w:type="spellEnd"/>
+      <w:r>
+        <w:rPr>
+          <w:rFonts w:ascii="Century Schoolbook" w:eastAsia="Century Schoolbook" w:hAnsi="Century Schoolbook" w:cs="Century Schoolbook"/>
+          <w:color w:val="000000"/>
+        </w:rPr>
+        <w:t xml:space="preserve"> y las distribuciones de </w:t>
+      </w:r>
+      <w:proofErr w:type="spellStart"/>
+      <w:r>
+        <w:rPr>
+          <w:rFonts w:ascii="Century Schoolbook" w:eastAsia="Century Schoolbook" w:hAnsi="Century Schoolbook" w:cs="Century Schoolbook"/>
+          <w:color w:val="000000"/>
+        </w:rPr>
+        <w:t>kernels</w:t>
+      </w:r>
+      <w:proofErr w:type="spellEnd"/>
+      <w:r>
+        <w:rPr>
+          <w:rFonts w:ascii="Century Schoolbook" w:eastAsia="Century Schoolbook" w:hAnsi="Century Schoolbook" w:cs="Century Schoolbook"/>
+          <w:color w:val="000000"/>
+        </w:rPr>
+        <w:t xml:space="preserve"> para </w:t>
       </w:r>
       <w:r>
         <w:rPr>
@@ -1490,13 +1817,43 @@
           <w:rFonts w:ascii="Century Schoolbook" w:eastAsia="Century Schoolbook" w:hAnsi="Century Schoolbook" w:cs="Century Schoolbook"/>
           <w:color w:val="000000"/>
         </w:rPr>
-        <w:t xml:space="preserve"> en estos dos panels (3-4 oraciones). </w:t>
-      </w:r>
-      <w:r>
-        <w:rPr>
-          <w:rFonts w:ascii="Century Schoolbook" w:eastAsia="Century Schoolbook" w:hAnsi="Century Schoolbook" w:cs="Century Schoolbook"/>
-        </w:rPr>
-        <w:t>En cada panel, sume una linea vertical con la línea de la pobreza calculada en el TP</w:t>
+        <w:t xml:space="preserve"> en estos dos </w:t>
+      </w:r>
+      <w:proofErr w:type="spellStart"/>
+      <w:r>
+        <w:rPr>
+          <w:rFonts w:ascii="Century Schoolbook" w:eastAsia="Century Schoolbook" w:hAnsi="Century Schoolbook" w:cs="Century Schoolbook"/>
+          <w:color w:val="000000"/>
+        </w:rPr>
+        <w:t>panels</w:t>
+      </w:r>
+      <w:proofErr w:type="spellEnd"/>
+      <w:r>
+        <w:rPr>
+          <w:rFonts w:ascii="Century Schoolbook" w:eastAsia="Century Schoolbook" w:hAnsi="Century Schoolbook" w:cs="Century Schoolbook"/>
+          <w:color w:val="000000"/>
+        </w:rPr>
+        <w:t xml:space="preserve"> (3-4 oraciones). </w:t>
+      </w:r>
+      <w:r>
+        <w:rPr>
+          <w:rFonts w:ascii="Century Schoolbook" w:eastAsia="Century Schoolbook" w:hAnsi="Century Schoolbook" w:cs="Century Schoolbook"/>
+        </w:rPr>
+        <w:t xml:space="preserve">En cada panel, sume una </w:t>
+      </w:r>
+      <w:proofErr w:type="spellStart"/>
+      <w:r>
+        <w:rPr>
+          <w:rFonts w:ascii="Century Schoolbook" w:eastAsia="Century Schoolbook" w:hAnsi="Century Schoolbook" w:cs="Century Schoolbook"/>
+        </w:rPr>
+        <w:t>linea</w:t>
+      </w:r>
+      <w:proofErr w:type="spellEnd"/>
+      <w:r>
+        <w:rPr>
+          <w:rFonts w:ascii="Century Schoolbook" w:eastAsia="Century Schoolbook" w:hAnsi="Century Schoolbook" w:cs="Century Schoolbook"/>
+        </w:rPr>
+        <w:t xml:space="preserve"> vertical con la línea de la pobreza calculada en el TP</w:t>
       </w:r>
       <w:r>
         <w:rPr>
@@ -1544,6 +1901,7 @@
         </w:rPr>
         <w:t xml:space="preserve">cree la variable </w:t>
       </w:r>
+      <w:proofErr w:type="spellStart"/>
       <w:r>
         <w:rPr>
           <w:rFonts w:ascii="Century Schoolbook" w:eastAsia="Century Schoolbook" w:hAnsi="Century Schoolbook" w:cs="Century Schoolbook"/>
@@ -1552,6 +1910,7 @@
         </w:rPr>
         <w:t>horastrab</w:t>
       </w:r>
+      <w:proofErr w:type="spellEnd"/>
       <w:r>
         <w:rPr>
           <w:rFonts w:ascii="Century Schoolbook" w:eastAsia="Century Schoolbook" w:hAnsi="Century Schoolbook" w:cs="Century Schoolbook"/>
@@ -1570,7 +1929,39 @@
           <w:rFonts w:ascii="Century Schoolbook" w:eastAsia="Century Schoolbook" w:hAnsi="Century Schoolbook" w:cs="Century Schoolbook"/>
           <w:color w:val="000000"/>
         </w:rPr>
-        <w:t xml:space="preserve"> descriptiva (promedio, sd, min, p50, max) de dicha variable creada y comente</w:t>
+        <w:t xml:space="preserve"> descriptiva (promedio, </w:t>
+      </w:r>
+      <w:proofErr w:type="spellStart"/>
+      <w:r>
+        <w:rPr>
+          <w:rFonts w:ascii="Century Schoolbook" w:eastAsia="Century Schoolbook" w:hAnsi="Century Schoolbook" w:cs="Century Schoolbook"/>
+          <w:color w:val="000000"/>
+        </w:rPr>
+        <w:t>sd</w:t>
+      </w:r>
+      <w:proofErr w:type="spellEnd"/>
+      <w:r>
+        <w:rPr>
+          <w:rFonts w:ascii="Century Schoolbook" w:eastAsia="Century Schoolbook" w:hAnsi="Century Schoolbook" w:cs="Century Schoolbook"/>
+          <w:color w:val="000000"/>
+        </w:rPr>
+        <w:t xml:space="preserve">, min, p50, </w:t>
+      </w:r>
+      <w:proofErr w:type="spellStart"/>
+      <w:r>
+        <w:rPr>
+          <w:rFonts w:ascii="Century Schoolbook" w:eastAsia="Century Schoolbook" w:hAnsi="Century Schoolbook" w:cs="Century Schoolbook"/>
+          <w:color w:val="000000"/>
+        </w:rPr>
+        <w:t>max</w:t>
+      </w:r>
+      <w:proofErr w:type="spellEnd"/>
+      <w:r>
+        <w:rPr>
+          <w:rFonts w:ascii="Century Schoolbook" w:eastAsia="Century Schoolbook" w:hAnsi="Century Schoolbook" w:cs="Century Schoolbook"/>
+          <w:color w:val="000000"/>
+        </w:rPr>
+        <w:t>) de dicha variable creada y comente</w:t>
       </w:r>
     </w:p>
     <w:p>
@@ -1846,7 +2237,21 @@
               <w:rPr>
                 <w:rFonts w:ascii="Century Schoolbook" w:eastAsia="Century Schoolbook" w:hAnsi="Century Schoolbook" w:cs="Century Schoolbook"/>
               </w:rPr>
-              <w:t>Cantidad de observaciones con NAs en la variable “Pobre”</w:t>
+              <w:t xml:space="preserve">Cantidad de observaciones con </w:t>
+            </w:r>
+            <w:proofErr w:type="spellStart"/>
+            <w:r>
+              <w:rPr>
+                <w:rFonts w:ascii="Century Schoolbook" w:eastAsia="Century Schoolbook" w:hAnsi="Century Schoolbook" w:cs="Century Schoolbook"/>
+              </w:rPr>
+              <w:t>NAs</w:t>
+            </w:r>
+            <w:proofErr w:type="spellEnd"/>
+            <w:r>
+              <w:rPr>
+                <w:rFonts w:ascii="Century Schoolbook" w:eastAsia="Century Schoolbook" w:hAnsi="Century Schoolbook" w:cs="Century Schoolbook"/>
+              </w:rPr>
+              <w:t xml:space="preserve"> en la variable “Pobre”</w:t>
             </w:r>
           </w:p>
         </w:tc>
@@ -2168,13 +2573,37 @@
           <w:rFonts w:ascii="Century Schoolbook" w:eastAsia="Century Schoolbook" w:hAnsi="Century Schoolbook" w:cs="Century Schoolbook"/>
           <w:color w:val="000000"/>
         </w:rPr>
-        <w:t xml:space="preserve"> En esta parte, solo necesita utilizar las variables: edad, edad2, educ, </w:t>
-      </w:r>
-      <w:r>
-        <w:rPr>
-          <w:rFonts w:ascii="Century Schoolbook" w:eastAsia="Century Schoolbook" w:hAnsi="Century Schoolbook" w:cs="Century Schoolbook"/>
-        </w:rPr>
-        <w:t>ingreso_total_familiar (ITF),</w:t>
+        <w:t xml:space="preserve"> En esta parte, solo necesita utilizar las variables: edad, edad2, </w:t>
+      </w:r>
+      <w:proofErr w:type="spellStart"/>
+      <w:r>
+        <w:rPr>
+          <w:rFonts w:ascii="Century Schoolbook" w:eastAsia="Century Schoolbook" w:hAnsi="Century Schoolbook" w:cs="Century Schoolbook"/>
+          <w:color w:val="000000"/>
+        </w:rPr>
+        <w:t>educ</w:t>
+      </w:r>
+      <w:proofErr w:type="spellEnd"/>
+      <w:r>
+        <w:rPr>
+          <w:rFonts w:ascii="Century Schoolbook" w:eastAsia="Century Schoolbook" w:hAnsi="Century Schoolbook" w:cs="Century Schoolbook"/>
+          <w:color w:val="000000"/>
+        </w:rPr>
+        <w:t xml:space="preserve">, </w:t>
+      </w:r>
+      <w:proofErr w:type="spellStart"/>
+      <w:r>
+        <w:rPr>
+          <w:rFonts w:ascii="Century Schoolbook" w:eastAsia="Century Schoolbook" w:hAnsi="Century Schoolbook" w:cs="Century Schoolbook"/>
+        </w:rPr>
+        <w:t>ingreso_total_familiar</w:t>
+      </w:r>
+      <w:proofErr w:type="spellEnd"/>
+      <w:r>
+        <w:rPr>
+          <w:rFonts w:ascii="Century Schoolbook" w:eastAsia="Century Schoolbook" w:hAnsi="Century Schoolbook" w:cs="Century Schoolbook"/>
+        </w:rPr>
+        <w:t xml:space="preserve"> (ITF),</w:t>
       </w:r>
       <w:r>
         <w:rPr>
@@ -2187,14 +2616,44 @@
         <w:rPr>
           <w:rFonts w:ascii="Century Schoolbook" w:eastAsia="Century Schoolbook" w:hAnsi="Century Schoolbook" w:cs="Century Schoolbook"/>
         </w:rPr>
-        <w:t>el número de miembros en el hogar (2005=IX_TOT y 2025=IX_Tot)</w:t>
-      </w:r>
-      <w:r>
-        <w:rPr>
-          <w:rFonts w:ascii="Century Schoolbook" w:eastAsia="Century Schoolbook" w:hAnsi="Century Schoolbook" w:cs="Century Schoolbook"/>
-          <w:color w:val="000000"/>
-        </w:rPr>
-        <w:t xml:space="preserve"> y horastrab. </w:t>
+        <w:t>el número de miembros en el hogar (2005=IX_TOT y 2025=</w:t>
+      </w:r>
+      <w:proofErr w:type="spellStart"/>
+      <w:r>
+        <w:rPr>
+          <w:rFonts w:ascii="Century Schoolbook" w:eastAsia="Century Schoolbook" w:hAnsi="Century Schoolbook" w:cs="Century Schoolbook"/>
+        </w:rPr>
+        <w:t>IX_Tot</w:t>
+      </w:r>
+      <w:proofErr w:type="spellEnd"/>
+      <w:r>
+        <w:rPr>
+          <w:rFonts w:ascii="Century Schoolbook" w:eastAsia="Century Schoolbook" w:hAnsi="Century Schoolbook" w:cs="Century Schoolbook"/>
+        </w:rPr>
+        <w:t>)</w:t>
+      </w:r>
+      <w:r>
+        <w:rPr>
+          <w:rFonts w:ascii="Century Schoolbook" w:eastAsia="Century Schoolbook" w:hAnsi="Century Schoolbook" w:cs="Century Schoolbook"/>
+          <w:color w:val="000000"/>
+        </w:rPr>
+        <w:t xml:space="preserve"> y </w:t>
+      </w:r>
+      <w:proofErr w:type="spellStart"/>
+      <w:r>
+        <w:rPr>
+          <w:rFonts w:ascii="Century Schoolbook" w:eastAsia="Century Schoolbook" w:hAnsi="Century Schoolbook" w:cs="Century Schoolbook"/>
+          <w:color w:val="000000"/>
+        </w:rPr>
+        <w:t>horastrab</w:t>
+      </w:r>
+      <w:proofErr w:type="spellEnd"/>
+      <w:r>
+        <w:rPr>
+          <w:rFonts w:ascii="Century Schoolbook" w:eastAsia="Century Schoolbook" w:hAnsi="Century Schoolbook" w:cs="Century Schoolbook"/>
+          <w:color w:val="000000"/>
+        </w:rPr>
+        <w:t xml:space="preserve">. </w:t>
       </w:r>
     </w:p>
     <w:p>
@@ -2406,6 +2865,7 @@
         </w:rPr>
         <w:t xml:space="preserve"> (</w:t>
       </w:r>
+      <w:proofErr w:type="spellStart"/>
       <w:r>
         <w:rPr>
           <w:rFonts w:ascii="Century Schoolbook" w:eastAsia="Century Schoolbook" w:hAnsi="Century Schoolbook" w:cs="Century Schoolbook"/>
@@ -2414,12 +2874,29 @@
         </w:rPr>
         <w:t>loading</w:t>
       </w:r>
-      <w:r>
-        <w:rPr>
-          <w:rFonts w:ascii="Century Schoolbook" w:eastAsia="Century Schoolbook" w:hAnsi="Century Schoolbook" w:cs="Century Schoolbook"/>
-          <w:color w:val="000000"/>
-        </w:rPr>
-        <w:t xml:space="preserve">) de PCA para el primer y segundo componente y comente los pesos que que le dan a cada variable utilizada. </w:t>
+      <w:proofErr w:type="spellEnd"/>
+      <w:r>
+        <w:rPr>
+          <w:rFonts w:ascii="Century Schoolbook" w:eastAsia="Century Schoolbook" w:hAnsi="Century Schoolbook" w:cs="Century Schoolbook"/>
+          <w:color w:val="000000"/>
+        </w:rPr>
+        <w:t xml:space="preserve">) de PCA para el primer y segundo componente y comente los pesos que </w:t>
+      </w:r>
+      <w:proofErr w:type="spellStart"/>
+      <w:r>
+        <w:rPr>
+          <w:rFonts w:ascii="Century Schoolbook" w:eastAsia="Century Schoolbook" w:hAnsi="Century Schoolbook" w:cs="Century Schoolbook"/>
+          <w:color w:val="000000"/>
+        </w:rPr>
+        <w:t>que</w:t>
+      </w:r>
+      <w:proofErr w:type="spellEnd"/>
+      <w:r>
+        <w:rPr>
+          <w:rFonts w:ascii="Century Schoolbook" w:eastAsia="Century Schoolbook" w:hAnsi="Century Schoolbook" w:cs="Century Schoolbook"/>
+          <w:color w:val="000000"/>
+        </w:rPr>
+        <w:t xml:space="preserve"> le dan a cada variable utilizada. </w:t>
       </w:r>
     </w:p>
     <w:p>
@@ -2503,6 +2980,7 @@
           <w:szCs w:val="28"/>
         </w:rPr>
       </w:pPr>
+      <w:proofErr w:type="spellStart"/>
       <w:r>
         <w:rPr>
           <w:rFonts w:ascii="Century Schoolbook" w:eastAsia="Century Schoolbook" w:hAnsi="Century Schoolbook" w:cs="Century Schoolbook"/>
@@ -2511,6 +2989,7 @@
         </w:rPr>
         <w:t>Cluster</w:t>
       </w:r>
+      <w:proofErr w:type="spellEnd"/>
     </w:p>
     <w:p>
       <w:pPr>
@@ -2532,13 +3011,23 @@
           <w:color w:val="000000"/>
         </w:rPr>
       </w:pPr>
+      <w:proofErr w:type="spellStart"/>
       <w:r>
         <w:rPr>
           <w:rFonts w:ascii="Century Schoolbook" w:eastAsia="Century Schoolbook" w:hAnsi="Century Schoolbook" w:cs="Century Schoolbook"/>
           <w:color w:val="000000"/>
           <w:u w:val="single"/>
         </w:rPr>
-        <w:t>Cluster k-medias</w:t>
+        <w:t>Cluster</w:t>
+      </w:r>
+      <w:proofErr w:type="spellEnd"/>
+      <w:r>
+        <w:rPr>
+          <w:rFonts w:ascii="Century Schoolbook" w:eastAsia="Century Schoolbook" w:hAnsi="Century Schoolbook" w:cs="Century Schoolbook"/>
+          <w:color w:val="000000"/>
+          <w:u w:val="single"/>
+        </w:rPr>
+        <w:t xml:space="preserve"> k-medias</w:t>
       </w:r>
       <w:r>
         <w:rPr>
@@ -2742,6 +3231,7 @@
         </w:rPr>
         <w:t xml:space="preserve">Usando la inspección visual de </w:t>
       </w:r>
+      <w:proofErr w:type="spellStart"/>
       <w:r>
         <w:rPr>
           <w:rFonts w:ascii="Century Schoolbook" w:eastAsia="Century Schoolbook" w:hAnsi="Century Schoolbook" w:cs="Century Schoolbook"/>
@@ -2749,6 +3239,7 @@
         </w:rPr>
         <w:t>Elbow</w:t>
       </w:r>
+      <w:proofErr w:type="spellEnd"/>
       <w:r>
         <w:rPr>
           <w:rFonts w:ascii="Cambria Math" w:eastAsia="Cambria Math" w:hAnsi="Cambria Math" w:cs="Cambria Math"/>
@@ -2759,7 +3250,21 @@
         <w:rPr>
           <w:rFonts w:ascii="Century Schoolbook" w:eastAsia="Century Schoolbook" w:hAnsi="Century Schoolbook" w:cs="Century Schoolbook"/>
         </w:rPr>
-        <w:t xml:space="preserve">¿cuál sería el número óptimo de clusters en su región? ¿Dicha cantidad de grupos nos ayudaría a distinguir entre </w:t>
+        <w:t xml:space="preserve">¿cuál sería el número óptimo de </w:t>
+      </w:r>
+      <w:proofErr w:type="spellStart"/>
+      <w:r>
+        <w:rPr>
+          <w:rFonts w:ascii="Century Schoolbook" w:eastAsia="Century Schoolbook" w:hAnsi="Century Schoolbook" w:cs="Century Schoolbook"/>
+        </w:rPr>
+        <w:t>clusters</w:t>
+      </w:r>
+      <w:proofErr w:type="spellEnd"/>
+      <w:r>
+        <w:rPr>
+          <w:rFonts w:ascii="Century Schoolbook" w:eastAsia="Century Schoolbook" w:hAnsi="Century Schoolbook" w:cs="Century Schoolbook"/>
+        </w:rPr>
+        <w:t xml:space="preserve"> en su región? ¿Dicha cantidad de grupos nos ayudaría a distinguir entre </w:t>
       </w:r>
       <w:r>
         <w:rPr>
@@ -2808,13 +3313,23 @@
           <w:color w:val="000000"/>
         </w:rPr>
       </w:pPr>
+      <w:proofErr w:type="spellStart"/>
       <w:r>
         <w:rPr>
           <w:rFonts w:ascii="Century Schoolbook" w:eastAsia="Century Schoolbook" w:hAnsi="Century Schoolbook" w:cs="Century Schoolbook"/>
           <w:color w:val="000000"/>
           <w:u w:val="single"/>
         </w:rPr>
-        <w:t>Cluster jerárquico</w:t>
+        <w:t>Cluster</w:t>
+      </w:r>
+      <w:proofErr w:type="spellEnd"/>
+      <w:r>
+        <w:rPr>
+          <w:rFonts w:ascii="Century Schoolbook" w:eastAsia="Century Schoolbook" w:hAnsi="Century Schoolbook" w:cs="Century Schoolbook"/>
+          <w:color w:val="000000"/>
+          <w:u w:val="single"/>
+        </w:rPr>
+        <w:t xml:space="preserve"> jerárquico</w:t>
       </w:r>
       <w:r>
         <w:rPr>
@@ -2834,7 +3349,55 @@
           <w:rFonts w:ascii="Century Schoolbook" w:eastAsia="Century Schoolbook" w:hAnsi="Century Schoolbook" w:cs="Century Schoolbook"/>
           <w:color w:val="000000"/>
         </w:rPr>
-        <w:t>tilizando las variables mencionadas arriba, realicen un análisis de clustering jerárquico. Generen un dendograma y expliquen brevemente qué es un dendograma.</w:t>
+        <w:t xml:space="preserve">tilizando las variables mencionadas arriba, realicen un análisis de </w:t>
+      </w:r>
+      <w:proofErr w:type="spellStart"/>
+      <w:r>
+        <w:rPr>
+          <w:rFonts w:ascii="Century Schoolbook" w:eastAsia="Century Schoolbook" w:hAnsi="Century Schoolbook" w:cs="Century Schoolbook"/>
+          <w:color w:val="000000"/>
+        </w:rPr>
+        <w:t>clustering</w:t>
+      </w:r>
+      <w:proofErr w:type="spellEnd"/>
+      <w:r>
+        <w:rPr>
+          <w:rFonts w:ascii="Century Schoolbook" w:eastAsia="Century Schoolbook" w:hAnsi="Century Schoolbook" w:cs="Century Schoolbook"/>
+          <w:color w:val="000000"/>
+        </w:rPr>
+        <w:t xml:space="preserve"> jerárquico. Generen un </w:t>
+      </w:r>
+      <w:proofErr w:type="spellStart"/>
+      <w:r>
+        <w:rPr>
+          <w:rFonts w:ascii="Century Schoolbook" w:eastAsia="Century Schoolbook" w:hAnsi="Century Schoolbook" w:cs="Century Schoolbook"/>
+          <w:color w:val="000000"/>
+        </w:rPr>
+        <w:t>dendograma</w:t>
+      </w:r>
+      <w:proofErr w:type="spellEnd"/>
+      <w:r>
+        <w:rPr>
+          <w:rFonts w:ascii="Century Schoolbook" w:eastAsia="Century Schoolbook" w:hAnsi="Century Schoolbook" w:cs="Century Schoolbook"/>
+          <w:color w:val="000000"/>
+        </w:rPr>
+        <w:t xml:space="preserve"> y expliquen brevemente qué es un </w:t>
+      </w:r>
+      <w:proofErr w:type="spellStart"/>
+      <w:r>
+        <w:rPr>
+          <w:rFonts w:ascii="Century Schoolbook" w:eastAsia="Century Schoolbook" w:hAnsi="Century Schoolbook" w:cs="Century Schoolbook"/>
+          <w:color w:val="000000"/>
+        </w:rPr>
+        <w:t>dendograma</w:t>
+      </w:r>
+      <w:proofErr w:type="spellEnd"/>
+      <w:r>
+        <w:rPr>
+          <w:rFonts w:ascii="Century Schoolbook" w:eastAsia="Century Schoolbook" w:hAnsi="Century Schoolbook" w:cs="Century Schoolbook"/>
+          <w:color w:val="000000"/>
+        </w:rPr>
+        <w:t>.</w:t>
       </w:r>
     </w:p>
     <w:p>
@@ -2855,18 +3418,41 @@
         </w:rPr>
         <w:t xml:space="preserve">(Opcional) </w:t>
       </w:r>
+      <w:proofErr w:type="spellStart"/>
       <w:r>
         <w:rPr>
           <w:rFonts w:ascii="Century Schoolbook" w:eastAsia="Century Schoolbook" w:hAnsi="Century Schoolbook" w:cs="Century Schoolbook"/>
           <w:u w:val="single"/>
         </w:rPr>
-        <w:t>Cluster k-moda:</w:t>
-      </w:r>
-      <w:r>
-        <w:rPr>
-          <w:rFonts w:ascii="Century Schoolbook" w:eastAsia="Century Schoolbook" w:hAnsi="Century Schoolbook" w:cs="Century Schoolbook"/>
-        </w:rPr>
-        <w:t xml:space="preserve"> Implemente cluster k-moda con </w:t>
+        <w:t>Cluster</w:t>
+      </w:r>
+      <w:proofErr w:type="spellEnd"/>
+      <w:r>
+        <w:rPr>
+          <w:rFonts w:ascii="Century Schoolbook" w:eastAsia="Century Schoolbook" w:hAnsi="Century Schoolbook" w:cs="Century Schoolbook"/>
+          <w:u w:val="single"/>
+        </w:rPr>
+        <w:t xml:space="preserve"> k-moda:</w:t>
+      </w:r>
+      <w:r>
+        <w:rPr>
+          <w:rFonts w:ascii="Century Schoolbook" w:eastAsia="Century Schoolbook" w:hAnsi="Century Schoolbook" w:cs="Century Schoolbook"/>
+        </w:rPr>
+        <w:t xml:space="preserve"> Implemente </w:t>
+      </w:r>
+      <w:proofErr w:type="spellStart"/>
+      <w:r>
+        <w:rPr>
+          <w:rFonts w:ascii="Century Schoolbook" w:eastAsia="Century Schoolbook" w:hAnsi="Century Schoolbook" w:cs="Century Schoolbook"/>
+        </w:rPr>
+        <w:t>cluster</w:t>
+      </w:r>
+      <w:proofErr w:type="spellEnd"/>
+      <w:r>
+        <w:rPr>
+          <w:rFonts w:ascii="Century Schoolbook" w:eastAsia="Century Schoolbook" w:hAnsi="Century Schoolbook" w:cs="Century Schoolbook"/>
+        </w:rPr>
+        <w:t xml:space="preserve"> k-moda con </w:t>
       </w:r>
       <m:oMath>
         <m:r>
@@ -2910,18 +3496,41 @@
         </w:rPr>
         <w:t xml:space="preserve"> y todas las variables </w:t>
       </w:r>
+      <w:proofErr w:type="spellStart"/>
       <w:r>
         <w:rPr>
           <w:rFonts w:ascii="Century Schoolbook" w:eastAsia="Century Schoolbook" w:hAnsi="Century Schoolbook" w:cs="Century Schoolbook"/>
           <w:b/>
         </w:rPr>
-        <w:t xml:space="preserve">dummies </w:t>
-      </w:r>
-      <w:r>
-        <w:rPr>
-          <w:rFonts w:ascii="Century Schoolbook" w:eastAsia="Century Schoolbook" w:hAnsi="Century Schoolbook" w:cs="Century Schoolbook"/>
-        </w:rPr>
-        <w:t xml:space="preserve">de la EPH que tiene en su base de datos limpias (excepto la categorica pobre y no pobre). ¿Puede el algoritmo con </w:t>
+        <w:t>dummies</w:t>
+      </w:r>
+      <w:proofErr w:type="spellEnd"/>
+      <w:r>
+        <w:rPr>
+          <w:rFonts w:ascii="Century Schoolbook" w:eastAsia="Century Schoolbook" w:hAnsi="Century Schoolbook" w:cs="Century Schoolbook"/>
+          <w:b/>
+        </w:rPr>
+        <w:t xml:space="preserve"> </w:t>
+      </w:r>
+      <w:r>
+        <w:rPr>
+          <w:rFonts w:ascii="Century Schoolbook" w:eastAsia="Century Schoolbook" w:hAnsi="Century Schoolbook" w:cs="Century Schoolbook"/>
+        </w:rPr>
+        <w:t xml:space="preserve">de la EPH que tiene en su base de datos limpias (excepto la </w:t>
+      </w:r>
+      <w:proofErr w:type="spellStart"/>
+      <w:r>
+        <w:rPr>
+          <w:rFonts w:ascii="Century Schoolbook" w:eastAsia="Century Schoolbook" w:hAnsi="Century Schoolbook" w:cs="Century Schoolbook"/>
+        </w:rPr>
+        <w:t>categorica</w:t>
+      </w:r>
+      <w:proofErr w:type="spellEnd"/>
+      <w:r>
+        <w:rPr>
+          <w:rFonts w:ascii="Century Schoolbook" w:eastAsia="Century Schoolbook" w:hAnsi="Century Schoolbook" w:cs="Century Schoolbook"/>
+        </w:rPr>
+        <w:t xml:space="preserve"> pobre y no pobre). ¿Puede el algoritmo con </w:t>
       </w:r>
       <m:oMath>
         <m:r>

</xml_diff>